<commit_message>
xuất file khảo sát, lưu ý có cài thêm thư viện
</commit_message>
<xml_diff>
--- a/public/templates/Bao_cao_khao_sat.docx
+++ b/public/templates/Bao_cao_khao_sat.docx
@@ -141,8 +141,8 @@
       </w:tblPr>
       <w:tblGrid>
         <w:gridCol w:w="2734"/>
-        <w:gridCol w:w="4659"/>
-        <w:gridCol w:w="2734"/>
+        <w:gridCol w:w="2832"/>
+        <w:gridCol w:w="4227"/>
       </w:tblGrid>
       <w:tr>
         <w:tc>
@@ -165,13 +165,13 @@
                 <w:b/>
                 <w:bCs/>
               </w:rPr>
-              <w:t>{#ListNhom}{STTNhom}</w:t>
-            </w:r>
-          </w:p>
-        </w:tc>
-        <w:tc>
-          <w:tcPr>
-            <w:tcW w:w="6232" w:type="dxa"/>
+              <w:t>I</w:t>
+            </w:r>
+          </w:p>
+        </w:tc>
+        <w:tc>
+          <w:tcPr>
+            <w:tcW w:w="4819" w:type="dxa"/>
             <w:vAlign w:val="center"/>
           </w:tcPr>
           <w:p>
@@ -188,13 +188,13 @@
                 <w:b/>
                 <w:bCs/>
               </w:rPr>
-              <w:t>{NHOM_KS}</w:t>
-            </w:r>
-          </w:p>
-        </w:tc>
-        <w:tc>
-          <w:tcPr>
-            <w:tcW w:w="3327" w:type="dxa"/>
+              <w:t>THÔNG TIN KHÁCH HÀNG</w:t>
+            </w:r>
+          </w:p>
+        </w:tc>
+        <w:tc>
+          <w:tcPr>
+            <w:tcW w:w="4740" w:type="dxa"/>
             <w:vAlign w:val="center"/>
           </w:tcPr>
           <w:p>
@@ -225,13 +225,659 @@
               <w:rPr>
                 <w:rFonts w:ascii="Arial" w:eastAsia="Arial" w:hAnsi="Arial" w:cs="Arial"/>
               </w:rPr>
+              <w:t>1</w:t>
+            </w:r>
+          </w:p>
+        </w:tc>
+        <w:tc>
+          <w:tcPr>
+            <w:tcW w:w="4819" w:type="dxa"/>
+            <w:vAlign w:val="center"/>
+          </w:tcPr>
+          <w:p>
+            <w:pPr>
+              <w:rPr>
+                <w:rFonts w:ascii="Arial" w:eastAsia="Arial" w:hAnsi="Arial" w:cs="Arial"/>
+              </w:rPr>
+            </w:pPr>
+            <w:r>
+              <w:rPr>
+                <w:rFonts w:ascii="Arial" w:eastAsia="Arial" w:hAnsi="Arial" w:cs="Arial"/>
+              </w:rPr>
+              <w:t>Tên Công Ty</w:t>
+            </w:r>
+          </w:p>
+        </w:tc>
+        <w:tc>
+          <w:tcPr>
+            <w:tcW w:w="4740" w:type="dxa"/>
+            <w:vAlign w:val="center"/>
+          </w:tcPr>
+          <w:p>
+            <w:pPr>
+              <w:rPr>
+                <w:rFonts w:ascii="Arial" w:eastAsia="Arial" w:hAnsi="Arial" w:cs="Arial"/>
+              </w:rPr>
+            </w:pPr>
+            <w:r>
+              <w:rPr>
+                <w:rFonts w:ascii="Arial" w:eastAsia="Arial" w:hAnsi="Arial" w:cs="Arial"/>
+              </w:rPr>
+              <w:t>{KHACH_HANG}</w:t>
+            </w:r>
+          </w:p>
+        </w:tc>
+      </w:tr>
+      <w:tr>
+        <w:tc>
+          <w:tcPr>
+            <w:tcW w:w="568" w:type="dxa"/>
+            <w:vAlign w:val="center"/>
+          </w:tcPr>
+          <w:p>
+            <w:pPr>
+              <w:jc w:val="center"/>
+              <w:rPr>
+                <w:rFonts w:ascii="Arial" w:eastAsia="Arial" w:hAnsi="Arial" w:cs="Arial"/>
+              </w:rPr>
+            </w:pPr>
+            <w:r>
+              <w:rPr>
+                <w:rFonts w:ascii="Arial" w:eastAsia="Arial" w:hAnsi="Arial" w:cs="Arial"/>
+              </w:rPr>
+              <w:t>2</w:t>
+            </w:r>
+          </w:p>
+        </w:tc>
+        <w:tc>
+          <w:tcPr>
+            <w:tcW w:w="4819" w:type="dxa"/>
+            <w:vAlign w:val="center"/>
+          </w:tcPr>
+          <w:p>
+            <w:pPr>
+              <w:rPr>
+                <w:rFonts w:ascii="Arial" w:eastAsia="Arial" w:hAnsi="Arial" w:cs="Arial"/>
+              </w:rPr>
+            </w:pPr>
+            <w:r>
+              <w:rPr>
+                <w:rFonts w:ascii="Arial" w:eastAsia="Arial" w:hAnsi="Arial" w:cs="Arial"/>
+              </w:rPr>
+              <w:t>Tên Khách hàng/ Người đại diện</w:t>
+            </w:r>
+          </w:p>
+        </w:tc>
+        <w:tc>
+          <w:tcPr>
+            <w:tcW w:w="4740" w:type="dxa"/>
+            <w:vAlign w:val="center"/>
+          </w:tcPr>
+          <w:p>
+            <w:pPr>
+              <w:rPr>
+                <w:rFonts w:ascii="Arial" w:eastAsia="Arial" w:hAnsi="Arial" w:cs="Arial"/>
+              </w:rPr>
+            </w:pPr>
+            <w:r>
+              <w:rPr>
+                <w:rFonts w:ascii="Arial" w:eastAsia="Arial" w:hAnsi="Arial" w:cs="Arial"/>
+              </w:rPr>
+              <w:t>{NGUOI_DAI_DIEN}</w:t>
+            </w:r>
+          </w:p>
+        </w:tc>
+      </w:tr>
+      <w:tr>
+        <w:tc>
+          <w:tcPr>
+            <w:tcW w:w="568" w:type="dxa"/>
+            <w:vAlign w:val="center"/>
+          </w:tcPr>
+          <w:p>
+            <w:pPr>
+              <w:jc w:val="center"/>
+              <w:rPr>
+                <w:rFonts w:ascii="Arial" w:eastAsia="Arial" w:hAnsi="Arial" w:cs="Arial"/>
+              </w:rPr>
+            </w:pPr>
+          </w:p>
+        </w:tc>
+        <w:tc>
+          <w:tcPr>
+            <w:tcW w:w="4819" w:type="dxa"/>
+            <w:vAlign w:val="center"/>
+          </w:tcPr>
+          <w:p>
+            <w:pPr>
+              <w:rPr>
+                <w:rFonts w:ascii="Arial" w:eastAsia="Arial" w:hAnsi="Arial" w:cs="Arial"/>
+              </w:rPr>
+            </w:pPr>
+            <w:r>
+              <w:rPr>
+                <w:rFonts w:ascii="Arial" w:eastAsia="Arial" w:hAnsi="Arial" w:cs="Arial"/>
+              </w:rPr>
+              <w:t>Di động:</w:t>
+            </w:r>
+          </w:p>
+        </w:tc>
+        <w:tc>
+          <w:tcPr>
+            <w:tcW w:w="4740" w:type="dxa"/>
+            <w:vAlign w:val="center"/>
+          </w:tcPr>
+          <w:p>
+            <w:pPr>
+              <w:rPr>
+                <w:rFonts w:ascii="Arial" w:eastAsia="Arial" w:hAnsi="Arial" w:cs="Arial"/>
+              </w:rPr>
+            </w:pPr>
+            <w:r>
+              <w:rPr>
+                <w:rFonts w:ascii="Arial" w:eastAsia="Arial" w:hAnsi="Arial" w:cs="Arial"/>
+              </w:rPr>
+              <w:t>{SDT_NDD}</w:t>
+            </w:r>
+          </w:p>
+        </w:tc>
+      </w:tr>
+      <w:tr>
+        <w:tc>
+          <w:tcPr>
+            <w:tcW w:w="568" w:type="dxa"/>
+            <w:vAlign w:val="center"/>
+          </w:tcPr>
+          <w:p>
+            <w:pPr>
+              <w:jc w:val="center"/>
+              <w:rPr>
+                <w:rFonts w:ascii="Arial" w:eastAsia="Arial" w:hAnsi="Arial" w:cs="Arial"/>
+              </w:rPr>
+            </w:pPr>
+          </w:p>
+        </w:tc>
+        <w:tc>
+          <w:tcPr>
+            <w:tcW w:w="4819" w:type="dxa"/>
+            <w:vAlign w:val="center"/>
+          </w:tcPr>
+          <w:p>
+            <w:pPr>
+              <w:rPr>
+                <w:rFonts w:ascii="Arial" w:eastAsia="Arial" w:hAnsi="Arial" w:cs="Arial"/>
+              </w:rPr>
+            </w:pPr>
+            <w:r>
+              <w:rPr>
+                <w:rFonts w:ascii="Arial" w:eastAsia="Arial" w:hAnsi="Arial" w:cs="Arial"/>
+              </w:rPr>
+              <w:t>Email</w:t>
+            </w:r>
+          </w:p>
+        </w:tc>
+        <w:tc>
+          <w:tcPr>
+            <w:tcW w:w="4740" w:type="dxa"/>
+            <w:vAlign w:val="center"/>
+          </w:tcPr>
+          <w:p>
+            <w:pPr>
+              <w:rPr>
+                <w:rFonts w:ascii="Arial" w:eastAsia="Arial" w:hAnsi="Arial" w:cs="Arial"/>
+              </w:rPr>
+            </w:pPr>
+            <w:r>
+              <w:rPr>
+                <w:rFonts w:ascii="Arial" w:eastAsia="Arial" w:hAnsi="Arial" w:cs="Arial"/>
+              </w:rPr>
+              <w:t>{EMAIL_NDD}</w:t>
+            </w:r>
+          </w:p>
+        </w:tc>
+      </w:tr>
+      <w:tr>
+        <w:tc>
+          <w:tcPr>
+            <w:tcW w:w="568" w:type="dxa"/>
+            <w:vAlign w:val="center"/>
+          </w:tcPr>
+          <w:p>
+            <w:pPr>
+              <w:jc w:val="center"/>
+              <w:rPr>
+                <w:rFonts w:ascii="Arial" w:eastAsia="Arial" w:hAnsi="Arial" w:cs="Arial"/>
+              </w:rPr>
+            </w:pPr>
+            <w:r>
+              <w:rPr>
+                <w:rFonts w:ascii="Arial" w:eastAsia="Arial" w:hAnsi="Arial" w:cs="Arial"/>
+              </w:rPr>
+              <w:t>3</w:t>
+            </w:r>
+          </w:p>
+        </w:tc>
+        <w:tc>
+          <w:tcPr>
+            <w:tcW w:w="4819" w:type="dxa"/>
+            <w:vAlign w:val="center"/>
+          </w:tcPr>
+          <w:p>
+            <w:pPr>
+              <w:rPr>
+                <w:rFonts w:ascii="Arial" w:eastAsia="Arial" w:hAnsi="Arial" w:cs="Arial"/>
+              </w:rPr>
+            </w:pPr>
+            <w:r>
+              <w:rPr>
+                <w:rFonts w:ascii="Arial" w:eastAsia="Arial" w:hAnsi="Arial" w:cs="Arial"/>
+              </w:rPr>
+              <w:t>Địa chỉ</w:t>
+            </w:r>
+          </w:p>
+        </w:tc>
+        <w:tc>
+          <w:tcPr>
+            <w:tcW w:w="4740" w:type="dxa"/>
+            <w:vAlign w:val="center"/>
+          </w:tcPr>
+          <w:p>
+            <w:pPr>
+              <w:rPr>
+                <w:rFonts w:ascii="Arial" w:eastAsia="Arial" w:hAnsi="Arial" w:cs="Arial"/>
+              </w:rPr>
+            </w:pPr>
+            <w:r>
+              <w:rPr>
+                <w:rFonts w:ascii="Arial" w:eastAsia="Arial" w:hAnsi="Arial" w:cs="Arial"/>
+              </w:rPr>
+              <w:t>{DIA_CHI}</w:t>
+            </w:r>
+          </w:p>
+        </w:tc>
+      </w:tr>
+      <w:tr>
+        <w:tc>
+          <w:tcPr>
+            <w:tcW w:w="568" w:type="dxa"/>
+            <w:vAlign w:val="center"/>
+          </w:tcPr>
+          <w:p>
+            <w:pPr>
+              <w:jc w:val="center"/>
+              <w:rPr>
+                <w:rFonts w:ascii="Arial" w:eastAsia="Arial" w:hAnsi="Arial" w:cs="Arial"/>
+              </w:rPr>
+            </w:pPr>
+            <w:r>
+              <w:rPr>
+                <w:rFonts w:ascii="Arial" w:eastAsia="Arial" w:hAnsi="Arial" w:cs="Arial"/>
+              </w:rPr>
+              <w:t>4</w:t>
+            </w:r>
+          </w:p>
+        </w:tc>
+        <w:tc>
+          <w:tcPr>
+            <w:tcW w:w="4819" w:type="dxa"/>
+            <w:vAlign w:val="center"/>
+          </w:tcPr>
+          <w:p>
+            <w:pPr>
+              <w:rPr>
+                <w:rFonts w:ascii="Arial" w:eastAsia="Arial" w:hAnsi="Arial" w:cs="Arial"/>
+              </w:rPr>
+            </w:pPr>
+            <w:r>
+              <w:rPr>
+                <w:rFonts w:ascii="Arial" w:eastAsia="Arial" w:hAnsi="Arial" w:cs="Arial"/>
+              </w:rPr>
+              <w:t>Điện thoại</w:t>
+            </w:r>
+          </w:p>
+        </w:tc>
+        <w:tc>
+          <w:tcPr>
+            <w:tcW w:w="4740" w:type="dxa"/>
+            <w:vAlign w:val="center"/>
+          </w:tcPr>
+          <w:p>
+            <w:pPr>
+              <w:rPr>
+                <w:rFonts w:ascii="Arial" w:eastAsia="Arial" w:hAnsi="Arial" w:cs="Arial"/>
+              </w:rPr>
+            </w:pPr>
+            <w:r>
+              <w:rPr>
+                <w:rFonts w:ascii="Arial" w:eastAsia="Arial" w:hAnsi="Arial" w:cs="Arial"/>
+              </w:rPr>
+              <w:t>{KHTN_SDT}</w:t>
+            </w:r>
+          </w:p>
+        </w:tc>
+      </w:tr>
+      <w:tr>
+        <w:tc>
+          <w:tcPr>
+            <w:tcW w:w="568" w:type="dxa"/>
+            <w:vAlign w:val="center"/>
+          </w:tcPr>
+          <w:p>
+            <w:pPr>
+              <w:jc w:val="center"/>
+              <w:rPr>
+                <w:rFonts w:ascii="Arial" w:eastAsia="Arial" w:hAnsi="Arial" w:cs="Arial"/>
+              </w:rPr>
+            </w:pPr>
+            <w:r>
+              <w:rPr>
+                <w:rFonts w:ascii="Arial" w:eastAsia="Arial" w:hAnsi="Arial" w:cs="Arial"/>
+              </w:rPr>
+              <w:t>6</w:t>
+            </w:r>
+          </w:p>
+        </w:tc>
+        <w:tc>
+          <w:tcPr>
+            <w:tcW w:w="4819" w:type="dxa"/>
+            <w:vAlign w:val="center"/>
+          </w:tcPr>
+          <w:p>
+            <w:pPr>
+              <w:rPr>
+                <w:rFonts w:ascii="Arial" w:eastAsia="Arial" w:hAnsi="Arial" w:cs="Arial"/>
+              </w:rPr>
+            </w:pPr>
+            <w:r>
+              <w:rPr>
+                <w:rFonts w:ascii="Arial" w:eastAsia="Arial" w:hAnsi="Arial" w:cs="Arial"/>
+              </w:rPr>
+              <w:t>Email:</w:t>
+            </w:r>
+          </w:p>
+        </w:tc>
+        <w:tc>
+          <w:tcPr>
+            <w:tcW w:w="4740" w:type="dxa"/>
+            <w:vAlign w:val="center"/>
+          </w:tcPr>
+          <w:p>
+            <w:pPr>
+              <w:rPr>
+                <w:rFonts w:ascii="Arial" w:eastAsia="Arial" w:hAnsi="Arial" w:cs="Arial"/>
+              </w:rPr>
+            </w:pPr>
+            <w:r>
+              <w:rPr>
+                <w:rFonts w:ascii="Arial" w:eastAsia="Arial" w:hAnsi="Arial" w:cs="Arial"/>
+              </w:rPr>
+              <w:t>{KHTN_EMAIL}</w:t>
+            </w:r>
+          </w:p>
+        </w:tc>
+      </w:tr>
+      <w:tr>
+        <w:tc>
+          <w:tcPr>
+            <w:tcW w:w="568" w:type="dxa"/>
+            <w:vAlign w:val="center"/>
+          </w:tcPr>
+          <w:p>
+            <w:pPr>
+              <w:jc w:val="center"/>
+              <w:rPr>
+                <w:rFonts w:ascii="Arial" w:eastAsia="Arial" w:hAnsi="Arial" w:cs="Arial"/>
+              </w:rPr>
+            </w:pPr>
+            <w:r>
+              <w:rPr>
+                <w:rFonts w:ascii="Arial" w:eastAsia="Arial" w:hAnsi="Arial" w:cs="Arial"/>
+              </w:rPr>
+              <w:t>7</w:t>
+            </w:r>
+          </w:p>
+        </w:tc>
+        <w:tc>
+          <w:tcPr>
+            <w:tcW w:w="4819" w:type="dxa"/>
+            <w:vAlign w:val="center"/>
+          </w:tcPr>
+          <w:p>
+            <w:pPr>
+              <w:rPr>
+                <w:rFonts w:ascii="Arial" w:eastAsia="Arial" w:hAnsi="Arial" w:cs="Arial"/>
+              </w:rPr>
+            </w:pPr>
+            <w:r>
+              <w:rPr>
+                <w:rFonts w:ascii="Arial" w:eastAsia="Arial" w:hAnsi="Arial" w:cs="Arial"/>
+              </w:rPr>
+              <w:t>Người liên hệ</w:t>
+            </w:r>
+          </w:p>
+        </w:tc>
+        <w:tc>
+          <w:tcPr>
+            <w:tcW w:w="4740" w:type="dxa"/>
+            <w:vAlign w:val="center"/>
+          </w:tcPr>
+          <w:p>
+            <w:pPr>
+              <w:rPr>
+                <w:rFonts w:ascii="Arial" w:eastAsia="Arial" w:hAnsi="Arial" w:cs="Arial"/>
+              </w:rPr>
+            </w:pPr>
+            <w:r>
+              <w:rPr>
+                <w:rFonts w:ascii="Arial" w:eastAsia="Arial" w:hAnsi="Arial" w:cs="Arial"/>
+              </w:rPr>
+              <w:t>{NGUOI_LIEN_HE}</w:t>
+            </w:r>
+          </w:p>
+        </w:tc>
+      </w:tr>
+      <w:tr>
+        <w:tc>
+          <w:tcPr>
+            <w:tcW w:w="568" w:type="dxa"/>
+            <w:vAlign w:val="center"/>
+          </w:tcPr>
+          <w:p>
+            <w:pPr>
+              <w:jc w:val="center"/>
+              <w:rPr>
+                <w:rFonts w:ascii="Arial" w:eastAsia="Arial" w:hAnsi="Arial" w:cs="Arial"/>
+              </w:rPr>
+            </w:pPr>
+            <w:r>
+              <w:rPr>
+                <w:rFonts w:ascii="Arial" w:eastAsia="Arial" w:hAnsi="Arial" w:cs="Arial"/>
+              </w:rPr>
+              <w:t>8</w:t>
+            </w:r>
+          </w:p>
+        </w:tc>
+        <w:tc>
+          <w:tcPr>
+            <w:tcW w:w="4819" w:type="dxa"/>
+            <w:vAlign w:val="center"/>
+          </w:tcPr>
+          <w:p>
+            <w:pPr>
+              <w:rPr>
+                <w:rFonts w:ascii="Arial" w:eastAsia="Arial" w:hAnsi="Arial" w:cs="Arial"/>
+              </w:rPr>
+            </w:pPr>
+            <w:r>
+              <w:rPr>
+                <w:rFonts w:ascii="Arial" w:eastAsia="Arial" w:hAnsi="Arial" w:cs="Arial"/>
+              </w:rPr>
+              <w:t>Người khảo sát *</w:t>
+            </w:r>
+          </w:p>
+        </w:tc>
+        <w:tc>
+          <w:tcPr>
+            <w:tcW w:w="4740" w:type="dxa"/>
+            <w:vAlign w:val="center"/>
+          </w:tcPr>
+          <w:p>
+            <w:pPr>
+              <w:rPr>
+                <w:rFonts w:ascii="Arial" w:eastAsia="Arial" w:hAnsi="Arial" w:cs="Arial"/>
+              </w:rPr>
+            </w:pPr>
+            <w:r>
+              <w:rPr>
+                <w:rFonts w:ascii="Arial" w:eastAsia="Arial" w:hAnsi="Arial" w:cs="Arial"/>
+              </w:rPr>
+              <w:t>{</w:t>
+            </w:r>
+            <w:r>
+              <w:rPr>
+                <w:rFonts w:ascii="Arial" w:eastAsia="Arial" w:hAnsi="Arial" w:cs="Arial"/>
+              </w:rPr>
+              <w:t>NGUOI_KHAO_SAT</w:t>
+            </w:r>
+            <w:r>
+              <w:rPr>
+                <w:rFonts w:ascii="Arial" w:eastAsia="Arial" w:hAnsi="Arial" w:cs="Arial"/>
+              </w:rPr>
+              <w:t>}</w:t>
+            </w:r>
+          </w:p>
+        </w:tc>
+      </w:tr>
+      <w:tr>
+        <w:tc>
+          <w:tcPr>
+            <w:tcW w:w="568" w:type="dxa"/>
+            <w:vAlign w:val="center"/>
+          </w:tcPr>
+          <w:p>
+            <w:pPr>
+              <w:jc w:val="center"/>
+              <w:rPr>
+                <w:rFonts w:ascii="Arial" w:eastAsia="Arial" w:hAnsi="Arial" w:cs="Arial"/>
+              </w:rPr>
+            </w:pPr>
+          </w:p>
+        </w:tc>
+        <w:tc>
+          <w:tcPr>
+            <w:tcW w:w="4819" w:type="dxa"/>
+            <w:vAlign w:val="center"/>
+          </w:tcPr>
+          <w:p>
+            <w:pPr>
+              <w:rPr>
+                <w:rFonts w:ascii="Arial" w:eastAsia="Arial" w:hAnsi="Arial" w:cs="Arial"/>
+              </w:rPr>
+            </w:pPr>
+          </w:p>
+        </w:tc>
+        <w:tc>
+          <w:tcPr>
+            <w:tcW w:w="4740" w:type="dxa"/>
+            <w:vAlign w:val="center"/>
+          </w:tcPr>
+          <w:p>
+            <w:pPr>
+              <w:rPr>
+                <w:rFonts w:ascii="Arial" w:eastAsia="Arial" w:hAnsi="Arial" w:cs="Arial"/>
+              </w:rPr>
+            </w:pPr>
+          </w:p>
+        </w:tc>
+      </w:tr>
+      <w:tr>
+        <w:tc>
+          <w:tcPr>
+            <w:tcW w:w="568" w:type="dxa"/>
+            <w:vAlign w:val="center"/>
+          </w:tcPr>
+          <w:p>
+            <w:pPr>
+              <w:jc w:val="center"/>
+              <w:rPr>
+                <w:rFonts w:ascii="Arial" w:eastAsia="Arial" w:hAnsi="Arial" w:cs="Arial"/>
+                <w:b/>
+                <w:bCs/>
+              </w:rPr>
+            </w:pPr>
+            <w:r>
+              <w:rPr>
+                <w:rFonts w:ascii="Arial" w:eastAsia="Arial" w:hAnsi="Arial" w:cs="Arial"/>
+                <w:b/>
+                <w:bCs/>
+              </w:rPr>
+              <w:t>{#ListNhom}{STTNhom}</w:t>
+            </w:r>
+          </w:p>
+        </w:tc>
+        <w:tc>
+          <w:tcPr>
+            <w:tcW w:w="4819" w:type="dxa"/>
+            <w:vAlign w:val="center"/>
+          </w:tcPr>
+          <w:p>
+            <w:pPr>
+              <w:rPr>
+                <w:rFonts w:ascii="Arial" w:eastAsia="Arial" w:hAnsi="Arial" w:cs="Arial"/>
+                <w:b/>
+                <w:bCs/>
+              </w:rPr>
+            </w:pPr>
+            <w:r>
+              <w:rPr>
+                <w:rFonts w:ascii="Arial" w:eastAsia="Arial" w:hAnsi="Arial" w:cs="Arial"/>
+                <w:b/>
+                <w:bCs/>
+              </w:rPr>
+              <w:t>{NHOM_KS}</w:t>
+            </w:r>
+          </w:p>
+        </w:tc>
+        <w:tc>
+          <w:tcPr>
+            <w:tcW w:w="4740" w:type="dxa"/>
+            <w:vAlign w:val="center"/>
+          </w:tcPr>
+          <w:p>
+            <w:pPr>
+              <w:rPr>
+                <w:rFonts w:ascii="Arial" w:eastAsia="Arial" w:hAnsi="Arial" w:cs="Arial"/>
+                <w:b/>
+                <w:bCs/>
+              </w:rPr>
+            </w:pPr>
+          </w:p>
+        </w:tc>
+      </w:tr>
+      <w:tr>
+        <w:tc>
+          <w:tcPr>
+            <w:tcW w:w="568" w:type="dxa"/>
+            <w:vAlign w:val="center"/>
+          </w:tcPr>
+          <w:p>
+            <w:pPr>
+              <w:jc w:val="center"/>
+              <w:rPr>
+                <w:rFonts w:ascii="Arial" w:eastAsia="Arial" w:hAnsi="Arial" w:cs="Arial"/>
+              </w:rPr>
+            </w:pPr>
+            <w:r>
+              <w:rPr>
+                <w:rFonts w:ascii="Arial" w:eastAsia="Arial" w:hAnsi="Arial" w:cs="Arial"/>
+              </w:rPr>
               <w:t>{#ListHangMuc}{STT}</w:t>
             </w:r>
           </w:p>
         </w:tc>
         <w:tc>
           <w:tcPr>
-            <w:tcW w:w="6232" w:type="dxa"/>
+            <w:tcW w:w="4819" w:type="dxa"/>
             <w:vAlign w:val="center"/>
           </w:tcPr>
           <w:p>
@@ -250,32 +896,20 @@
         </w:tc>
         <w:tc>
           <w:tcPr>
-            <w:tcW w:w="3327" w:type="dxa"/>
-            <w:vAlign w:val="center"/>
-          </w:tcPr>
-          <w:p>
-            <w:pPr>
-              <w:rPr>
-                <w:rFonts w:ascii="Arial" w:eastAsia="Arial" w:hAnsi="Arial" w:cs="Arial"/>
-              </w:rPr>
-            </w:pPr>
-            <w:r>
-              <w:rPr>
-                <w:rFonts w:ascii="Arial" w:eastAsia="Arial" w:hAnsi="Arial" w:cs="Arial"/>
-              </w:rPr>
-              <w:t xml:space="preserve">{CHI_TIET}{/ </w:t>
-            </w:r>
-            <w:r>
-              <w:rPr>
-                <w:rFonts w:ascii="Arial" w:eastAsia="Arial" w:hAnsi="Arial" w:cs="Arial"/>
-              </w:rPr>
-              <w:t>ListHangMuc</w:t>
-            </w:r>
-            <w:r>
-              <w:rPr>
-                <w:rFonts w:ascii="Arial" w:eastAsia="Arial" w:hAnsi="Arial" w:cs="Arial"/>
-              </w:rPr>
-              <w:t xml:space="preserve"> }</w:t>
+            <w:tcW w:w="4740" w:type="dxa"/>
+            <w:vAlign w:val="center"/>
+          </w:tcPr>
+          <w:p>
+            <w:pPr>
+              <w:rPr>
+                <w:rFonts w:ascii="Arial" w:eastAsia="Arial" w:hAnsi="Arial" w:cs="Arial"/>
+              </w:rPr>
+            </w:pPr>
+            <w:r>
+              <w:rPr>
+                <w:rFonts w:ascii="Arial" w:eastAsia="Arial" w:hAnsi="Arial" w:cs="Arial"/>
+              </w:rPr>
+              <w:t>{CHI_TIET}{/ListHangMuc}</w:t>
             </w:r>
             <w:r>
               <w:rPr>
@@ -293,7 +927,7 @@
               <w:rPr>
                 <w:rFonts w:ascii="Arial" w:eastAsia="Arial" w:hAnsi="Arial" w:cs="Arial"/>
               </w:rPr>
-              <w:t>KSCTNhom}</w:t>
+              <w:t>ListNhom}</w:t>
             </w:r>
           </w:p>
         </w:tc>
@@ -357,23 +991,17 @@
               <w:rPr>
                 <w:rFonts w:ascii="Arial" w:eastAsia="Arial" w:hAnsi="Arial" w:cs="Arial"/>
               </w:rPr>
-              <w:t>{#HINH_ANH}</w:t>
-            </w:r>
-          </w:p>
-          <w:p>
-            <w:pPr>
-              <w:jc w:val="center"/>
-              <w:rPr>
-                <w:rFonts w:ascii="Arial" w:eastAsia="Arial" w:hAnsi="Arial" w:cs="Arial"/>
-              </w:rPr>
-            </w:pPr>
-            <w:r>
-              <w:rPr>
-                <w:rFonts w:ascii="Arial" w:eastAsia="Arial" w:hAnsi="Arial" w:cs="Arial"/>
-              </w:rPr>
-              <w:t>{%URL_HINH}</w:t>
-            </w:r>
-          </w:p>
+              <w:t>{#HINH_ANH}{%URL_HINH}</w:t>
+            </w:r>
+          </w:p>
+        </w:tc>
+      </w:tr>
+      <w:tr>
+        <w:tc>
+          <w:tcPr>
+            <w:tcW w:w="10065" w:type="dxa"/>
+            <w:vAlign w:val="center"/>
+          </w:tcPr>
           <w:p>
             <w:pPr>
               <w:jc w:val="center"/>
@@ -391,16 +1019,6 @@
               </w:rPr>
               <w:t>{TEN_HINH}</w:t>
             </w:r>
-          </w:p>
-          <w:p>
-            <w:pPr>
-              <w:jc w:val="center"/>
-              <w:rPr>
-                <w:rFonts w:ascii="Arial" w:eastAsia="Arial" w:hAnsi="Arial" w:cs="Arial"/>
-                <w:b/>
-                <w:bCs/>
-              </w:rPr>
-            </w:pPr>
             <w:r>
               <w:rPr>
                 <w:rFonts w:ascii="Arial" w:eastAsia="Arial" w:hAnsi="Arial" w:cs="Arial"/>
@@ -437,53 +1055,82 @@
         <w:t>PHẦN 3: CÁC NHẬN ĐỊNH, ĐÁNH GIÁ, ĐỀ XUẤT</w:t>
       </w:r>
     </w:p>
+    <w:tbl>
+      <w:tblPr>
+        <w:tblStyle w:val="TableNormal0"/>
+        <w:tblW w:w="0" w:type="auto"/>
+        <w:tblInd w:w="5" w:type="dxa"/>
+        <w:tblCellMar>
+          <w:top w:w="28" w:type="dxa"/>
+          <w:bottom w:w="28" w:type="dxa"/>
+        </w:tblCellMar>
+        <w:tblLook w:val="04A0" w:firstRow="1" w:lastRow="0" w:firstColumn="1" w:lastColumn="0" w:noHBand="0" w:noVBand="1"/>
+      </w:tblPr>
+      <w:tblGrid>
+        <w:gridCol w:w="9651"/>
+      </w:tblGrid>
+      <w:tr>
+        <w:tc>
+          <w:tcPr>
+            <w:tcW w:w="9980" w:type="dxa"/>
+          </w:tcPr>
+          <w:p>
+            <w:pPr>
+              <w:spacing w:after="0"/>
+              <w:rPr>
+                <w:rFonts w:ascii="Arial" w:eastAsia="Arial" w:hAnsi="Arial" w:cs="Arial"/>
+                <w:b/>
+                <w:bCs/>
+                <w:u w:val="single"/>
+              </w:rPr>
+            </w:pPr>
+            <w:r>
+              <w:rPr>
+                <w:rFonts w:ascii="Arial" w:eastAsia="Arial" w:hAnsi="Arial" w:cs="Arial"/>
+                <w:b/>
+                <w:bCs/>
+                <w:u w:val="single"/>
+              </w:rPr>
+              <w:t>{#ListNhomP3}{NHOM_KS}</w:t>
+            </w:r>
+          </w:p>
+        </w:tc>
+      </w:tr>
+      <w:tr>
+        <w:tc>
+          <w:tcPr>
+            <w:tcW w:w="9980" w:type="dxa"/>
+          </w:tcPr>
+          <w:p>
+            <w:pPr>
+              <w:spacing w:after="0"/>
+              <w:ind w:left="720"/>
+              <w:rPr>
+                <w:rFonts w:ascii="Arial" w:eastAsia="Arial" w:hAnsi="Arial" w:cs="Arial"/>
+              </w:rPr>
+            </w:pPr>
+            <w:r>
+              <w:rPr>
+                <w:rFonts w:ascii="Arial" w:eastAsia="Arial" w:hAnsi="Arial" w:cs="Arial"/>
+              </w:rPr>
+              <w:t>{CHI_TIET}{/ListNhomP3}</w:t>
+            </w:r>
+          </w:p>
+        </w:tc>
+      </w:tr>
+    </w:tbl>
     <w:p>
       <w:pPr>
-        <w:rPr>
-          <w:rFonts w:ascii="Arial" w:eastAsia="Arial" w:hAnsi="Arial" w:cs="Arial"/>
-          <w:b/>
-          <w:bCs/>
-          <w:u w:val="single"/>
-        </w:rPr>
-      </w:pPr>
-      <w:r>
-        <w:rPr>
-          <w:rFonts w:ascii="Arial" w:eastAsia="Arial" w:hAnsi="Arial" w:cs="Arial"/>
-          <w:b/>
-          <w:bCs/>
-          <w:u w:val="single"/>
-        </w:rPr>
-        <w:t>{#ListNhomP3}{NHOM_KS}</w:t>
-      </w:r>
-    </w:p>
-    <w:p>
-      <w:pPr>
-        <w:spacing w:after="0"/>
-        <w:ind w:left="720"/>
+        <w:spacing w:after="0" w:line="360" w:lineRule="auto"/>
         <w:rPr>
           <w:rFonts w:ascii="Arial" w:eastAsia="Arial" w:hAnsi="Arial" w:cs="Arial"/>
         </w:rPr>
       </w:pPr>
-      <w:r>
-        <w:rPr>
-          <w:rFonts w:ascii="Arial" w:eastAsia="Arial" w:hAnsi="Arial" w:cs="Arial"/>
-        </w:rPr>
-        <w:t>{CHI_TIET}{/LISTNomP3}</w:t>
-      </w:r>
-    </w:p>
-    <w:p>
-      <w:pPr>
-        <w:spacing w:after="0" w:line="360" w:lineRule="auto"/>
-        <w:ind w:left="720"/>
-        <w:rPr>
-          <w:rFonts w:ascii="Arial" w:eastAsia="Arial" w:hAnsi="Arial" w:cs="Arial"/>
-        </w:rPr>
-      </w:pPr>
     </w:p>
     <w:sectPr>
       <w:headerReference w:type="default" r:id="rId8"/>
-      <w:pgSz w:w="12240" w:h="15840"/>
-      <w:pgMar w:top="1440" w:right="810" w:bottom="900" w:left="1440" w:header="720" w:footer="720" w:gutter="0"/>
+      <w:pgSz w:w="11907" w:h="16840" w:code="9"/>
+      <w:pgMar w:top="1440" w:right="811" w:bottom="902" w:left="1440" w:header="720" w:footer="720" w:gutter="0"/>
       <w:pgNumType w:start="1"/>
       <w:cols w:space="720"/>
     </w:sectPr>
@@ -2078,6 +2725,7 @@
   <w:style w:type="character" w:default="1" w:styleId="DefaultParagraphFont">
     <w:name w:val="Default Paragraph Font"/>
     <w:uiPriority w:val="1"/>
+    <w:semiHidden/>
     <w:unhideWhenUsed/>
   </w:style>
   <w:style w:type="table" w:default="1" w:styleId="TableNormal">

</xml_diff>